<commit_message>
Align shorter defense speech with seven timed presentation slides
</commit_message>
<xml_diff>
--- a/web/downloads/Qalam-7-minutes.docx
+++ b/web/downloads/Qalam-7-minutes.docx
@@ -4,120 +4,30 @@
   <w:body>
     <w:p>
       <w:pPr>
-        <w:pStyle w:val="Title"/>
+        <w:pStyle w:val="Heading1"/>
       </w:pPr>
       <w:r>
-        <w:t>Ғылыми жобаны 7 минутта қорғау</w:t>
+        <w:t>Qalam: 7 минуттық қорғау сөзі</w:t>
       </w:r>
     </w:p>
     <w:p>
       <w:r>
-        <w:t>Тақырып: «Онлайн кітапхана: кітапхана жұмысын цифрландыру»</w:t>
+        <w:t>«Онлайн кітапхана: кітапхана жұмысын цифрландыру»</w:t>
       </w:r>
     </w:p>
     <w:p>
       <w:r>
-        <w:t>Оқушылар: Мұхаметкәрім Айбын Таңатұлы, Амантай Елжан Ерланұлы — 7-сынып.</w:t>
+        <w:t>«Қаныш Сәтпаев атындағы Жәнтікей орта мектебі» КММ</w:t>
       </w:r>
     </w:p>
     <w:p>
       <w:r>
-        <w:t>Ғылыми жетекші: Мұхаметкәрім Қаныш Саятұлы.</w:t>
+        <w:t>Авторлар: Мұхаметкәрім Айбын Таңатұлы, Амантай Елжан Ерланұлы. Ғылыми жетекші: Мұхаметкәрім Қаныш Саятұлы.</w:t>
       </w:r>
     </w:p>
     <w:p>
       <w:r>
-        <w:t>Мектеп: «Қаныш Сәтпаев атындағы Жәнтікей орта мектебі» КММ.</w:t>
-      </w:r>
-    </w:p>
-    <w:p>
-      <w:r>
-        <w:t>Уақыт: 7 минут, соның ішінде сайтты көрсету — 2 минут 20 секунд. Уақыт бөлінісі — репетицияға арналған жоспар; нақты ұзақтығы сөйлеу қарқынына байланысты.</w:t>
-      </w:r>
-    </w:p>
-    <w:p>
-      <w:pPr>
-        <w:pStyle w:val="Heading1"/>
-      </w:pPr>
-      <w:r>
-        <w:t>1. Кіріспе · 0:00–0:40 · Айбын</w:t>
-      </w:r>
-    </w:p>
-    <w:p>
-      <w:r>
-        <w:t>Сәлеметсіздер ме, құрметті қазылар алқасы, ұстаздар және оқушылар! Біз — жетінші сынып оқушылары Мұхаметкәрім Айбын және Амантай Елжан. Жобамыздың тақырыбы — «Онлайн кітапхана: кітапхана жұмысын цифрландыру». Ғылыми жетекшіміз — Мұхаметкәрім Қаныш Саятұлы.</w:t>
-      </w:r>
-    </w:p>
-    <w:p>
-      <w:r>
-        <w:t xml:space="preserve">Біз мектеп кітапханасын алмастыруды емес, оның жұмысын жеңілдетуді мақсат еттік. Сол үшін Qalam атты сайт дайындадық. Ол оқушыға кітап таңдауға, ал кітапханашыға кітап қозғалысын тіркеуге көмектеседі. </w:t>
-      </w:r>
-    </w:p>
-    <w:p>
-      <w:pPr>
-        <w:pStyle w:val="Heading1"/>
-      </w:pPr>
-      <w:r>
-        <w:t>2. Мәселе және мақсат · 0:40–1:25 · Елжан</w:t>
-      </w:r>
-    </w:p>
-    <w:p>
-      <w:r>
-        <w:t>Кітап оқығысы келген оқушы кейде қандай шығарма таңдарын білмейді. Кітаптың кітапханада бар-жоғын білу үшін де қосымша сұрау қажет болады. Ал кітапханашы кімнің қандай кітап алғанын, оны қайтарғанын немесе қайтармағанын бақылауы керек.</w:t>
-      </w:r>
-    </w:p>
-    <w:p>
-      <w:r>
-        <w:t xml:space="preserve">Біздің мақсатымыз — осы ақпаратты бір жүйеге жинақтау. Сайттан кітап атауын немесе авторын іздеуге, жанр бойынша таңдауға және қордағы дана санын көруге болады. </w:t>
-      </w:r>
-    </w:p>
-    <w:p>
-      <w:pPr>
-        <w:pStyle w:val="Heading1"/>
-      </w:pPr>
-      <w:r>
-        <w:t>3. Зерттеу сұрағы мен әдісі · 1:25–2:15 · Айбын</w:t>
-      </w:r>
-    </w:p>
-    <w:p>
-      <w:r>
-        <w:t>Зерттеу сұрағымыз: «Онлайн каталог қажетті кітап туралы ақпаратты табуды жеңілдете ме және оқуға қызығушылыққа қалай әсер етеді?» Болжамымыз — іздеу, жанр сүзгісі және жеке ұсыныстар кітап таңдауды жеңілдетуі мүмкін.</w:t>
-      </w:r>
-    </w:p>
-    <w:p>
-      <w:r>
-        <w:t xml:space="preserve">Мұны тексеру үшін оқушыларға бірдей кітаптар тізімі бойынша тапсырма береміз. Бір топ алдымен қағаз тізіммен, кейін сайтпен жұмыс істейді; екінші топ кері ретпен орындайды. Іздеуге кеткен уақыт пен жауаптың дұрыстығын тіркейміз. </w:t>
-      </w:r>
-    </w:p>
-    <w:p>
-      <w:r>
-        <w:t>Қызығушылықты сайтты қолданғанға дейін және кейін бірдей сауалнама арқылы салыстырамыз. Әзірге өлшенген нәтижелер ұсынылған жоқ, сондықтан «уақыт қысқарды» немесе «қызығушылық артты» деп қорытынды жасамаймыз.</w:t>
-      </w:r>
-    </w:p>
-    <w:p>
-      <w:pPr>
-        <w:pStyle w:val="Heading1"/>
-      </w:pPr>
-      <w:r>
-        <w:t>4. Сайттың құрылымы · 2:15–2:55 · Елжан</w:t>
-      </w:r>
-    </w:p>
-    <w:p>
-      <w:r>
-        <w:t xml:space="preserve">Qalam сайтында мектеп атауы мен логотипі, электрондық каталог, оқырман аккаунты және кітапханашының басқару панелі бар. Аккаунттарды кітапханашы ашады. </w:t>
-      </w:r>
-    </w:p>
-    <w:p>
-      <w:r>
-        <w:t>Кітап туралы мәліметтер, ортақ пікірлер және кітап беру жазбалары сервердің дерекқорында сақталады. Кітапханашы қор санын өзгертіп, кітапты бергенін және қайтарылғанын тіркейді. Рейтинг әр бөлек қайтарылған кітап үшін он ұпай береді. Енді сайттағы негізгі әрекеттерді іс жүзінде көрсетейік.</w:t>
-      </w:r>
-    </w:p>
-    <w:p>
-      <w:pPr>
-        <w:pStyle w:val="Heading1"/>
-      </w:pPr>
-      <w:r>
-        <w:t>5. Практикалық көрсету · 2:55–5:15 · Екеуі кезектеседі</w:t>
+        <w:t>7 слайд · 7 минут. Сайтты көрсету — 4 минут. Слайд ауысқан сайын төмендегі сәйкес мәтінді айтыңыз.</w:t>
       </w:r>
     </w:p>
     <w:p>
@@ -125,17 +35,12 @@
         <w:pStyle w:val="Heading2"/>
       </w:pPr>
       <w:r>
-        <w:t>2:55–3:20 · Айбын: кітап іздеу</w:t>
+        <w:t>1-слайд. Онлайн кітапхана · 0:00–0:30 · Айбын</w:t>
       </w:r>
     </w:p>
     <w:p>
       <w:r>
-        <w:t>Алдымен каталогтан «Абай жолы» кітабын іздеймін. Атауды енгізгенде сәйкес кітап көрсетіледі. Жанр батырмалары каталогты қажетті санатпен шектейді. Кітапты ашқанда сипаттамасын, жалпы дана санын, кітапханада қалғанын және оқырмандардағы санын көреміз.</w:t>
-      </w:r>
-    </w:p>
-    <w:p>
-      <w:r>
-        <w:t>[Әрекет: каталогқа өту → «Абай жолы» деп іздеу → кітапты ашу.]</w:t>
+        <w:t>Сәлеметсіздер ме, құрметті қазылар алқасы! Біз — жетінші сынып оқушылары Айбын және Елжан. Жобамыздың тақырыбы — «Онлайн кітапхана: кітапхана жұмысын цифрландыру». Ғылыми жетекшіміз — Мұхаметкәрім Қаныш Саятұлы. Біз мектеп кітапханасына арналған Qalam веб-жүйесін жасадық.</w:t>
       </w:r>
     </w:p>
     <w:p>
@@ -143,17 +48,12 @@
         <w:pStyle w:val="Heading2"/>
       </w:pPr>
       <w:r>
-        <w:t>3:20–3:45 · Елжан: аккаунт, сөре және пікір</w:t>
+        <w:t>2-слайд. Жобаның мақсаты · 0:30–1:00 · Елжан</w:t>
       </w:r>
     </w:p>
     <w:p>
       <w:r>
-        <w:t>Оқушы аккаунтында кітапты жеке сөреге сақтауға, бірден беске дейін баға беруге және пікір қалдыруға болады. Пікір мен орташа рейтинг басқа оқырмандарға да көрінеді. Брондау кітапты үш күнге резервке қояды. Кітапханашы оны бергенде брондау орындалған болып белгіленеді.</w:t>
-      </w:r>
-    </w:p>
-    <w:p>
-      <w:r>
-        <w:t>[Әрекет: алдын ала кірген тест оқушысының сөресін ашу; дайын пікір мен орташа бағаны көрсету.]</w:t>
+        <w:t>Мақсатымыз — кітап іздеу, онлайн брондау және кітап беру есебін бір жүйеге біріктіру. Оқушы кітапты атауы, авторы немесе жанры бойынша табады. Кітапханашы қорды басқарып, әр оқушының алған және қайтарған кітаптарын бақылайды.</w:t>
       </w:r>
     </w:p>
     <w:p>
@@ -161,17 +61,12 @@
         <w:pStyle w:val="Heading2"/>
       </w:pPr>
       <w:r>
-        <w:t>3:45–4:10 · Айбын: кітап таңдау және challenge</w:t>
+        <w:t>3-слайд. Зерттеу әдісі · 1:00–1:40 · Айбын</w:t>
       </w:r>
     </w:p>
     <w:p>
       <w:r>
-        <w:t>«Маған кітап таңда» бөлімінде жас, жанр, қызығушылық және қолжетімділік туралы төрт сұрақ бар. Жауаптар бойынша үш кітап ұсынылады. «Осы айда үш кітап оқы» challenge-і жеке мақсат қоюға көмектеседі. Оқушының өзі қойған белгі мектеп рейтингіне ұпай қоспайды.</w:t>
-      </w:r>
-    </w:p>
-    <w:p>
-      <w:r>
-        <w:t>[Әрекет: сауалнаманы жылдам толтыру → ұсыныстарды көрсету; challenge жолағын көрсету.]</w:t>
+        <w:t>Зерттеу сұрағымыз: цифрлық кітапхана кітап таңдауға және оқуға қызығушылыққа қалай әсер етеді? Бағалау үшін қағаз каталог пен сайттағы бірдей тапсырмаларды салыстырамыз. Іздеу уақытын, дұрыс табылған жауаптарды және сайтты қолданғанға дейінгі, кейінгі сауалнама жауаптарын тіркейміз.</w:t>
       </w:r>
     </w:p>
     <w:p>
@@ -179,17 +74,12 @@
         <w:pStyle w:val="Heading2"/>
       </w:pPr>
       <w:r>
-        <w:t>4:10–4:50 · Елжан: кітапханашы кабинеті</w:t>
+        <w:t>4-слайд. Qalam мүмкіндіктері · 1:40–2:10 · Елжан</w:t>
       </w:r>
     </w:p>
     <w:p>
       <w:r>
-        <w:t xml:space="preserve">Енді кітапханашы аккаунтында оқушыны таңдаймын. Оның кітап тарихында алған кітабы, алу күні және қайтару мерзімі көрсетіледі. Кітап қайтарылса, тиісті батырмамен белгілейміз. Қайтармаған кітап бөлек көрінеді, мерзімі өтсе соны да көрсетеді. </w:t>
-      </w:r>
-    </w:p>
-    <w:p>
-      <w:r>
-        <w:t>[Әрекет: бөлек тест оқушысының тарихын ашу → бір кітап беру → «Қайтарды деп белгілеу» → қор мен рейтингті көрсету. Нақты оқушының есебін демонстрация үшін өзгертпеңіз.]</w:t>
+        <w:t>Сайтта оқушы кабинеті, кітапханашының басқару панелі және кітап қорының дерекқоры бар. Пікірлер мен бағалар барлық оқырманға көрінеді. Кітапханашы пікірді жасырып, қайта қоса алады. Жүйе кітап тарихын, оқушы және сынып рейтингін көрсетеді. Енді осы мүмкіндіктерді көрсетеміз.</w:t>
       </w:r>
     </w:p>
     <w:p>
@@ -197,135 +87,136 @@
         <w:pStyle w:val="Heading2"/>
       </w:pPr>
       <w:r>
-        <w:t>4:50–5:15 · Айбын: зерттеу сауалнамасы</w:t>
+        <w:t>5-слайд. Практикалық көрсету · 2:10–6:10 · Айбын + Елжан</w:t>
+      </w:r>
+    </w:p>
+    <w:p>
+      <w:pPr>
+        <w:pStyle w:val="Heading3"/>
+      </w:pPr>
+      <w:r>
+        <w:t>2:10–2:50 · Айбын</w:t>
       </w:r>
     </w:p>
     <w:p>
       <w:r>
-        <w:t xml:space="preserve">Соңында «Сауалнама» бөлімін көрсетемін. Оқушы сайтты қолданғанға дейін және кейін қызығушылығы, кітап таңдаудың жеңілдігі және оқу ниеті туралы жауап береді. Кітапханашы жиынтық нәтижелерді және ең ұнаған функцияларды көреді. </w:t>
+        <w:t>Каталогтан «Абай жолы» кітабын іздеймін. Кітапты ашқанда жалпы дана саны, кітапханада қалғаны және оқырмандардағы саны көрсетіледі. Жанр сүзгісі қажетті кітаптарды таңдауға мүмкіндік береді.</w:t>
       </w:r>
     </w:p>
     <w:p>
       <w:r>
-        <w:t>[Әрекет: «Сауалнама» формасын, кейін кітапханашыдағы нәтижелер бетін көрсету. Демо жауаптарды нақты зерттеу нәтижесі деп атамаңыз.]</w:t>
+        <w:t>Экрандағы әрекет: Каталог → «Абай жолы» іздеу → кітапты ашу → дана санын көрсету.</w:t>
       </w:r>
     </w:p>
     <w:p>
       <w:pPr>
-        <w:pStyle w:val="Heading1"/>
+        <w:pStyle w:val="Heading3"/>
       </w:pPr>
       <w:r>
-        <w:t>6. Ғылыми мәні және шектеулері · 5:15–6:15 · Елжан</w:t>
+        <w:t>2:50–3:40 · Елжан</w:t>
       </w:r>
     </w:p>
     <w:p>
       <w:r>
-        <w:t xml:space="preserve">Жобаның ғылыми мәні — жүйені тәжірибемен бағалау. Негізгі өлшемдеріміз — уақыт, дұрыс табылған ақпарат және пайдаланушы пікірі. </w:t>
+        <w:t>Оқушы аккаунтынан кітапты брондаймын. Брондау үш күнге сақталады. Кітапты жеке сөреге қосып, баға мен пікір қалдыруға болады. Ортақ пікір мен орташа баға басқа оқырмандарға да көрінеді.</w:t>
       </w:r>
     </w:p>
     <w:p>
       <w:r>
-        <w:t>Зерттеуге қатысу ерікті болуы керек. Оқушылардың жеке мәліметтері мен кітап тарихын ашық жарияламаймыз; кітап тарихына рұқсат шектелген. Жасанды интеллектті код жазуға көмекші ретінде қолдандық, ал шешімдерді тексеру — біздің міндетіміз.</w:t>
+        <w:t>Экрандағы әрекет: Тест оқушысы → бос кітапты брондау → сөре, баға және дайын пікірді көрсету.</w:t>
+      </w:r>
+    </w:p>
+    <w:p>
+      <w:pPr>
+        <w:pStyle w:val="Heading3"/>
+      </w:pPr>
+      <w:r>
+        <w:t>3:40–4:20 · Айбын</w:t>
       </w:r>
     </w:p>
     <w:p>
       <w:r>
-        <w:t>Қазіргі каталогты мектептің нақты қорымен сәйкестендіру қажет. Сондай-ақ сервер қайта іске қосылғанда деректер жоғалмауы үшін тұрақты сақтау орны керек. Сауалнамадағы жақсы пікір нақты оқылған кітап саны артты дегенді өздігінен дәлелдемейді.</w:t>
+        <w:t>«Маған кітап таңда» бөліміндегі сұрақтарға жауап беремін. Жүйе қызығушылығыма сәйкес кітаптар ұсынады. Оқу challenge-інде оқушы осы айда үш кітап оқу мақсатын белгілейді.</w:t>
+      </w:r>
+    </w:p>
+    <w:p>
+      <w:r>
+        <w:t>Экрандағы әрекет: Кітап таңдау сұрақтары → ұсыныстар → оқу challenge-і.</w:t>
       </w:r>
     </w:p>
     <w:p>
       <w:pPr>
-        <w:pStyle w:val="Heading1"/>
+        <w:pStyle w:val="Heading3"/>
       </w:pPr>
       <w:r>
-        <w:t>7. Қорытынды · 6:15–7:00 · Айбын, соңғы сөйлем екеуі бірге</w:t>
+        <w:t>4:20–5:30 · Елжан</w:t>
       </w:r>
     </w:p>
     <w:p>
       <w:r>
-        <w:t>Қорытындылай келе, біз мектеп кітапханасына арналған Qalam веб-жүйесін дайындадық. Ол кітап іздеуді, оқырманмен байланысты және кітап беру есебін біріктіреді.</w:t>
+        <w:t>Кітапханашы кабинетінде жанр мен кітап қосып, дана санын өзгертуге болады. Оқушының тарихынан қандай кітап алғанын, қайтарғанын және қайтару мерзімін көреміз. Қазір тест аккаунтына кітап беріп, қайтарылғанын белгілеймін. Қор саны мен оқырман рейтингі жаңарады.</w:t>
       </w:r>
     </w:p>
     <w:p>
       <w:r>
-        <w:t xml:space="preserve">Келесі қадамымыз — каталогты нақты кітап қорымен толықтыру, мектеппен келісіп сынақ өткізу және өлшенген нәтижелерді салыстыру. Qalam оқушының кітаппен танысуын жеңілдетіп, кітапханашының есебін реттеуге арналған. </w:t>
+        <w:t>Экрандағы әрекет: Басқару панелі → қор → тест оқушысының тарихы → кітап беру → қайтару → рейтинг.</w:t>
+      </w:r>
+    </w:p>
+    <w:p>
+      <w:pPr>
+        <w:pStyle w:val="Heading3"/>
+      </w:pPr>
+      <w:r>
+        <w:t>5:30–6:10 · Айбын</w:t>
       </w:r>
     </w:p>
     <w:p>
       <w:r>
-        <w:t>Екеуі бірге: Назарларыңызға рақмет!</w:t>
+        <w:t>Статистикада кітап беру, қайтару және белсенді оқырмандар туралы мәліметтер жинақталады. Сауалнама оқушылардың сайтқа дейінгі және кейінгі жауаптарын салыстыруға арналған. Кітапханашы жинақталған нәтижелерді қарайды.</w:t>
+      </w:r>
+    </w:p>
+    <w:p>
+      <w:r>
+        <w:t>Экрандағы әрекет: Оқырман статистикасы → сауалнама → әкімшіге көрінетін жиынтық нәтижелер.</w:t>
       </w:r>
     </w:p>
     <w:p>
       <w:pPr>
-        <w:pStyle w:val="Heading1"/>
+        <w:pStyle w:val="Heading2"/>
       </w:pPr>
       <w:r>
-        <w:t>Репетицияға нұсқаулық — қорғауда оқылмайды</w:t>
+        <w:t>6-слайд. Жобаның ғылыми құндылығы · 6:10–6:35 · Елжан</w:t>
+      </w:r>
+    </w:p>
+    <w:p>
+      <w:r>
+        <w:t>Жобаның ғылыми құндылығы — цифрлық жүйені нақты өлшемдер арқылы бағалау. Іздеу уақыты, жауаптың дұрыстығы, оқырман белсенділігі және сауалнама кітапхана жұмысын талдауға мүмкіндік береді. Осы деректер негізінде жүйені жетілдіреміз.</w:t>
       </w:r>
     </w:p>
     <w:p>
       <w:pPr>
-        <w:pStyle w:val="ListBullet"/>
+        <w:pStyle w:val="Heading2"/>
       </w:pPr>
       <w:r>
-        <w:t>Айбын мен Елжан бір секундомер қолданыңыздар. Теория мен қорытындыға 4 минут 40 секунд, практикалық бөлімге 2 минут 20 секунд жоспарланған.</w:t>
+        <w:t>7-слайд. Qalam — мектептің цифрлық кітапханасы · 6:35–7:00 · Айбын · соңында екеуі бірге</w:t>
+      </w:r>
+    </w:p>
+    <w:p>
+      <w:r>
+        <w:t>Qalam кітап қорын, оқырманды және кітапханашыны ортақ платформаға біріктіреді. Жүйеде каталог, брондау, қорды басқару, оқырман статистикасы және кітап ұсыну мүмкіндіктері іске асырылды. Жобамыз мектеп кітапханасының жұмысын цифрландыруға бағытталған. Назарларыңызға рақмет!</w:t>
       </w:r>
     </w:p>
     <w:p>
       <w:pPr>
-        <w:pStyle w:val="ListBullet"/>
+        <w:pStyle w:val="Heading2"/>
       </w:pPr>
       <w:r>
-        <w:t>Экран әрекеттерін сөйлеумен қатар орындаңыздар. Бір іздеуді бірнеше рет қайталамаңыздар.</w:t>
+        <w:t>Дайындық нұсқауы — қорғауда оқылмайды</w:t>
       </w:r>
     </w:p>
     <w:p>
-      <w:pPr>
-        <w:pStyle w:val="ListBullet"/>
-      </w:pPr>
       <w:r>
-        <w:t>Сайтты қорғаудан бұрын ашып, сервердің оянуын күтіңіздер. Оқушы және кітапханашы аккаунттарын екі бөлек браузер профилінде дайындаңыздар.</w:t>
-      </w:r>
-    </w:p>
-    <w:p>
-      <w:pPr>
-        <w:pStyle w:val="ListBullet"/>
-      </w:pPr>
-      <w:r>
-        <w:t>Кітап беру/қайтару үшін тек арнайы тест аккаунтын пайдаланыңыздар; нақты оқушылардың аты-жөндерін экранға шығармаңыздар.</w:t>
-      </w:r>
-    </w:p>
-    <w:p>
-      <w:pPr>
-        <w:pStyle w:val="ListBullet"/>
-      </w:pPr>
-      <w:r>
-        <w:t>Пікір, рейтинг және нәтиже көрсетуге арналған дайын деректерді «демонстрациялық» деп түсіндіріңіздер. Оларды зерттеу нәтижесіне қоспаңыздар.</w:t>
-      </w:r>
-    </w:p>
-    <w:p>
-      <w:pPr>
-        <w:pStyle w:val="ListBullet"/>
-      </w:pPr>
-      <w:r>
-        <w:t>Сайтта кітаптардың толық мәтіні жоқ; оқу және тыңдау бөлімдері — демо. Нақты брондау серверде үш күн сақталады; кітапты бергенде кітапханашы оны орындалған деп тіркейді.</w:t>
-      </w:r>
-    </w:p>
-    <w:p>
-      <w:pPr>
-        <w:pStyle w:val="ListBullet"/>
-      </w:pPr>
-      <w:r>
-        <w:t>Сөйлеу баяу болса, 5-бөлімдегі 3:20–3:45 әрекетінде сөре мен бағаны ғана көрсетіп, жаңа пікір жазбаңыздар.</w:t>
-      </w:r>
-    </w:p>
-    <w:p>
-      <w:pPr>
-        <w:pStyle w:val="ListBullet"/>
-      </w:pPr>
-      <w:r>
-        <w:t>Интернет істемесе, сайттағы презентациямен жалғастырыңыздар. Бұл жағдайда тірі сайт әрекеттерін тексерілген деп айтпаңыздар.</w:t>
+        <w:t>Оқушы мен кітапханашы аккаунттарын екі бөлек браузер профилінде дайындаңыздар. Кітап беру және қайтару үшін арнайы тест аккаунтын қолданыңыздар. Сауалнамадағы демонстрациялық жауаптарды зерттеу деректеріне қоспаңыздар. Таймермен репетиция жасаңыздар: 4 минутта экран әрекеттерін сөйлеумен қатар орындаңыздар. Презентациядағы «Қорғау сөзі» батырмасы осы мәтінді ашады.</w:t>
       </w:r>
     </w:p>
     <w:sectPr>
@@ -703,7 +594,7 @@
     <w:rsid w:val="00FC693F"/>
     <w:rPr>
       <w:rFonts w:ascii="Arial" w:hAnsi="Arial"/>
-      <w:sz w:val="22"/>
+      <w:sz w:val="24"/>
     </w:rPr>
   </w:style>
   <w:style w:type="paragraph" w:styleId="Header">

</xml_diff>

<commit_message>
Align six-section defense speech with illustrated one-page presentation
</commit_message>
<xml_diff>
--- a/web/downloads/Qalam-7-minutes.docx
+++ b/web/downloads/Qalam-7-minutes.docx
@@ -7,7 +7,7 @@
         <w:pStyle w:val="Heading1"/>
       </w:pPr>
       <w:r>
-        <w:t>Qalam: 7 минуттық қорғау сөзі</w:t>
+        <w:t>Qalam: қысқартылған қорғау сөзі</w:t>
       </w:r>
     </w:p>
     <w:p>
@@ -27,7 +27,7 @@
     </w:p>
     <w:p>
       <w:r>
-        <w:t>7 слайд · 7 минут. Сайтты көрсету — 4 минут. Слайд ауысқан сайын төмендегі сәйкес мәтінді айтыңыз.</w:t>
+        <w:t>6 бөлім. Қорғау сөзі сайттағы бір беттік презентацияның бөлімдерімен сәйкес келеді. Мәтінді 7 минуттан аспайтын қорғауға қолдануға болады.</w:t>
       </w:r>
     </w:p>
     <w:p>
@@ -35,7 +35,7 @@
         <w:pStyle w:val="Heading2"/>
       </w:pPr>
       <w:r>
-        <w:t>1-слайд. Онлайн кітапхана · 0:00–0:30 · Айбын</w:t>
+        <w:t>1-бөлім. Онлайн кітапхана · Айбын</w:t>
       </w:r>
     </w:p>
     <w:p>
@@ -48,7 +48,7 @@
         <w:pStyle w:val="Heading2"/>
       </w:pPr>
       <w:r>
-        <w:t>2-слайд. Жобаның мақсаты · 0:30–1:00 · Елжан</w:t>
+        <w:t>2-бөлім. Жобаның мақсаты · Елжан</w:t>
       </w:r>
     </w:p>
     <w:p>
@@ -61,7 +61,7 @@
         <w:pStyle w:val="Heading2"/>
       </w:pPr>
       <w:r>
-        <w:t>3-слайд. Зерттеу әдісі · 1:00–1:40 · Айбын</w:t>
+        <w:t>3-бөлім. Зерттеу әдісі · Айбын</w:t>
       </w:r>
     </w:p>
     <w:p>
@@ -74,12 +74,12 @@
         <w:pStyle w:val="Heading2"/>
       </w:pPr>
       <w:r>
-        <w:t>4-слайд. Qalam мүмкіндіктері · 1:40–2:10 · Елжан</w:t>
+        <w:t>4-бөлім. Qalam мүмкіндіктері · Елжан</w:t>
       </w:r>
     </w:p>
     <w:p>
       <w:r>
-        <w:t>Сайтта оқушы кабинеті, кітапханашының басқару панелі және кітап қорының дерекқоры бар. Пікірлер мен бағалар барлық оқырманға көрінеді. Кітапханашы пікірді жасырып, қайта қоса алады. Жүйе кітап тарихын, оқушы және сынып рейтингін көрсетеді. Енді осы мүмкіндіктерді көрсетеміз.</w:t>
+        <w:t>Сайтта оқушы кабинеті, кітапханашының басқару панелі және кітап қорының дерекқоры бар. Пікірлер мен бағалар барлық оқырманға көрінеді. Кітапханашы пікірді жасырып, қайта қоса алады. Жүйе кітап тарихын, оқушы және сынып рейтингін көрсетеді.</w:t>
       </w:r>
     </w:p>
     <w:p>
@@ -87,105 +87,7 @@
         <w:pStyle w:val="Heading2"/>
       </w:pPr>
       <w:r>
-        <w:t>5-слайд. Практикалық көрсету · 2:10–6:10 · Айбын + Елжан</w:t>
-      </w:r>
-    </w:p>
-    <w:p>
-      <w:pPr>
-        <w:pStyle w:val="Heading3"/>
-      </w:pPr>
-      <w:r>
-        <w:t>2:10–2:50 · Айбын</w:t>
-      </w:r>
-    </w:p>
-    <w:p>
-      <w:r>
-        <w:t>Каталогтан «Абай жолы» кітабын іздеймін. Кітапты ашқанда жалпы дана саны, кітапханада қалғаны және оқырмандардағы саны көрсетіледі. Жанр сүзгісі қажетті кітаптарды таңдауға мүмкіндік береді.</w:t>
-      </w:r>
-    </w:p>
-    <w:p>
-      <w:r>
-        <w:t>Экрандағы әрекет: Каталог → «Абай жолы» іздеу → кітапты ашу → дана санын көрсету.</w:t>
-      </w:r>
-    </w:p>
-    <w:p>
-      <w:pPr>
-        <w:pStyle w:val="Heading3"/>
-      </w:pPr>
-      <w:r>
-        <w:t>2:50–3:40 · Елжан</w:t>
-      </w:r>
-    </w:p>
-    <w:p>
-      <w:r>
-        <w:t>Оқушы аккаунтынан кітапты брондаймын. Брондау үш күнге сақталады. Кітапты жеке сөреге қосып, баға мен пікір қалдыруға болады. Ортақ пікір мен орташа баға басқа оқырмандарға да көрінеді.</w:t>
-      </w:r>
-    </w:p>
-    <w:p>
-      <w:r>
-        <w:t>Экрандағы әрекет: Тест оқушысы → бос кітапты брондау → сөре, баға және дайын пікірді көрсету.</w:t>
-      </w:r>
-    </w:p>
-    <w:p>
-      <w:pPr>
-        <w:pStyle w:val="Heading3"/>
-      </w:pPr>
-      <w:r>
-        <w:t>3:40–4:20 · Айбын</w:t>
-      </w:r>
-    </w:p>
-    <w:p>
-      <w:r>
-        <w:t>«Маған кітап таңда» бөліміндегі сұрақтарға жауап беремін. Жүйе қызығушылығыма сәйкес кітаптар ұсынады. Оқу challenge-інде оқушы осы айда үш кітап оқу мақсатын белгілейді.</w:t>
-      </w:r>
-    </w:p>
-    <w:p>
-      <w:r>
-        <w:t>Экрандағы әрекет: Кітап таңдау сұрақтары → ұсыныстар → оқу challenge-і.</w:t>
-      </w:r>
-    </w:p>
-    <w:p>
-      <w:pPr>
-        <w:pStyle w:val="Heading3"/>
-      </w:pPr>
-      <w:r>
-        <w:t>4:20–5:30 · Елжан</w:t>
-      </w:r>
-    </w:p>
-    <w:p>
-      <w:r>
-        <w:t>Кітапханашы кабинетінде жанр мен кітап қосып, дана санын өзгертуге болады. Оқушының тарихынан қандай кітап алғанын, қайтарғанын және қайтару мерзімін көреміз. Қазір тест аккаунтына кітап беріп, қайтарылғанын белгілеймін. Қор саны мен оқырман рейтингі жаңарады.</w:t>
-      </w:r>
-    </w:p>
-    <w:p>
-      <w:r>
-        <w:t>Экрандағы әрекет: Басқару панелі → қор → тест оқушысының тарихы → кітап беру → қайтару → рейтинг.</w:t>
-      </w:r>
-    </w:p>
-    <w:p>
-      <w:pPr>
-        <w:pStyle w:val="Heading3"/>
-      </w:pPr>
-      <w:r>
-        <w:t>5:30–6:10 · Айбын</w:t>
-      </w:r>
-    </w:p>
-    <w:p>
-      <w:r>
-        <w:t>Статистикада кітап беру, қайтару және белсенді оқырмандар туралы мәліметтер жинақталады. Сауалнама оқушылардың сайтқа дейінгі және кейінгі жауаптарын салыстыруға арналған. Кітапханашы жинақталған нәтижелерді қарайды.</w:t>
-      </w:r>
-    </w:p>
-    <w:p>
-      <w:r>
-        <w:t>Экрандағы әрекет: Оқырман статистикасы → сауалнама → әкімшіге көрінетін жиынтық нәтижелер.</w:t>
-      </w:r>
-    </w:p>
-    <w:p>
-      <w:pPr>
-        <w:pStyle w:val="Heading2"/>
-      </w:pPr>
-      <w:r>
-        <w:t>6-слайд. Жобаның ғылыми құндылығы · 6:10–6:35 · Елжан</w:t>
+        <w:t>5-бөлім. Жобаның ғылыми құндылығы · Елжан</w:t>
       </w:r>
     </w:p>
     <w:p>
@@ -198,7 +100,7 @@
         <w:pStyle w:val="Heading2"/>
       </w:pPr>
       <w:r>
-        <w:t>7-слайд. Qalam — мектептің цифрлық кітапханасы · 6:35–7:00 · Айбын · соңында екеуі бірге</w:t>
+        <w:t>6-бөлім. Qalam — мектептің цифрлық кітапханасы · Айбын · соңында екеуі бірге</w:t>
       </w:r>
     </w:p>
     <w:p>
@@ -216,7 +118,7 @@
     </w:p>
     <w:p>
       <w:r>
-        <w:t>Оқушы мен кітапханашы аккаунттарын екі бөлек браузер профилінде дайындаңыздар. Кітап беру және қайтару үшін арнайы тест аккаунтын қолданыңыздар. Сауалнамадағы демонстрациялық жауаптарды зерттеу деректеріне қоспаңыздар. Таймермен репетиция жасаңыздар: 4 минутта экран әрекеттерін сөйлеумен қатар орындаңыздар. Презентациядағы «Қорғау сөзі» батырмасы осы мәтінді ашады.</w:t>
+        <w:t>Сайттың «Презентация» бөлімін ашыңыздар. Барлық бөлім бір бетте көрсетіледі. Айбын мен Елжан мәтінді бөлімдердің ретімен кезектесіп айтады. Қорғауға дейін мәтінді дауыстап оқып, ұзақтығын өлшеңіздер.</w:t>
       </w:r>
     </w:p>
     <w:sectPr>

</xml_diff>

<commit_message>
Shorten defense speech and presentation to simple Kazakh
</commit_message>
<xml_diff>
--- a/web/downloads/Qalam-7-minutes.docx
+++ b/web/downloads/Qalam-7-minutes.docx
@@ -27,7 +27,7 @@
     </w:p>
     <w:p>
       <w:r>
-        <w:t>6 бөлім. Қорғау сөзі сайттағы бір беттік презентацияның бөлімдерімен сәйкес келеді. Мәтінді 7 минуттан аспайтын қорғауға қолдануға болады.</w:t>
+        <w:t>6 қысқа бөлім. Мәтін презентациямен бірдей ретпен жазылған.</w:t>
       </w:r>
     </w:p>
     <w:p>
@@ -40,7 +40,7 @@
     </w:p>
     <w:p>
       <w:r>
-        <w:t>Қайырлы күн, құрметті қазылар алқасы! Біз — Қаныш Сәтпаев атындағы Жәнтікей орта мектебінің 7-сынып оқушылары Амантай Елжан және Мұхаметкәрім Айбын. Жобамыздың тақырыбы — «Онлайн кітапхана: кітапхана жұмысын цифрландыру». Ғылыми жетекшіміз — Мұхаметкәрім Қаныш Саятұлы. Біз мектеп кітапханасына арналған Qalam веб-жүйесін жасадық.</w:t>
+        <w:t>Қайырлы күн, құрметті қазылар! Біз — Қаныш Сәтпаев атындағы Жәнтікей орта мектебінің 7-сынып оқушылары Амантай Елжан және Мұхаметкәрім Айбын. Жетекшіміз — Мұхаметкәрім Қаныш Саятұлы. Жобамыз — Qalam онлайн кітапханасы.</w:t>
       </w:r>
     </w:p>
     <w:p>
@@ -48,12 +48,12 @@
         <w:pStyle w:val="Heading2"/>
       </w:pPr>
       <w:r>
-        <w:t>2-бөлім. Жобаның мақсаты · Елжан</w:t>
+        <w:t>2-бөлім. Мақсатымыз · Елжан</w:t>
       </w:r>
     </w:p>
     <w:p>
       <w:r>
-        <w:t>Мақсатымыз — кітап іздеу, онлайн брондау және кітап беру есебін бір жүйеге біріктіру. Оқушы кітапты атауы, авторы немесе жанры бойынша табады. Кітапханашы қорды басқарып, әр оқушының алған және қайтарған кітаптарын бақылайды.</w:t>
+        <w:t>Мақсатымыз — кітапты оңай табу, брондау және кітап қорын есепке алу.</w:t>
       </w:r>
     </w:p>
     <w:p>
@@ -66,7 +66,7 @@
     </w:p>
     <w:p>
       <w:r>
-        <w:t>Зерттеу сұрағымыз: цифрлық кітапхана кітап таңдауға және оқуға қызығушылыққа қалай әсер етеді? Бағалау үшін қағаз каталог пен сайттағы бірдей тапсырмаларды салыстырамыз. Іздеу уақытын, дұрыс табылған жауаптарды және сайтты қолданғанға дейінгі, кейінгі сауалнама жауаптарын тіркейміз.</w:t>
+        <w:t>Қағаз тізім мен сайттан кітап іздеуді салыстырамыз. Уақытын өлшейміз. Оқушылардан сауалнама аламыз.</w:t>
       </w:r>
     </w:p>
     <w:p>
@@ -74,12 +74,12 @@
         <w:pStyle w:val="Heading2"/>
       </w:pPr>
       <w:r>
-        <w:t>4-бөлім. Qalam мүмкіндіктері · Елжан</w:t>
+        <w:t>4-бөлім. Сайт мүмкіндіктері · Елжан</w:t>
       </w:r>
     </w:p>
     <w:p>
       <w:r>
-        <w:t>Сайтта оқушы кабинеті, кітапханашының басқару панелі және кітап қорының дерекқоры бар. Пікірлер мен бағалар барлық оқырманға көрінеді. Кітапханашы пікірді жасырып, қайта қоса алады. Жүйе кітап тарихын, оқушы және сынып рейтингін көрсетеді.</w:t>
+        <w:t>Оқушы кітап іздейді, брондайды және пікір жазады. Кітапханашы қорды басқарады, кітаптың берілуі мен қайтарылуын тіркейді. Сайтта кітап тарихы мен рейтинг бар.</w:t>
       </w:r>
     </w:p>
     <w:p>
@@ -87,12 +87,12 @@
         <w:pStyle w:val="Heading2"/>
       </w:pPr>
       <w:r>
-        <w:t>5-бөлім. Жобаның ғылыми құндылығы · Елжан</w:t>
+        <w:t>5-бөлім. Жобаның пайдасы · Елжан</w:t>
       </w:r>
     </w:p>
     <w:p>
       <w:r>
-        <w:t>Жобаның ғылыми құндылығы — цифрлық жүйені нақты өлшемдер арқылы бағалау. Іздеу уақыты, жауаптың дұрыстығы, оқырман белсенділігі және сауалнама кітапхана жұмысын талдауға мүмкіндік береді. Осы деректер негізінде жүйені жетілдіреміз.</w:t>
+        <w:t>Кітапты табуға кеткен уақыт пен оқушылардың пікірін бағалаймыз. Сол арқылы сайтты жақсартамыз.</w:t>
       </w:r>
     </w:p>
     <w:p>
@@ -100,12 +100,12 @@
         <w:pStyle w:val="Heading2"/>
       </w:pPr>
       <w:r>
-        <w:t>6-бөлім. Qalam — мектептің цифрлық кітапханасы · Айбын · соңында екеуі бірге</w:t>
+        <w:t>6-бөлім. Қорытынды · Айбын · соңында екеуі бірге</w:t>
       </w:r>
     </w:p>
     <w:p>
       <w:r>
-        <w:t>Qalam кітап қорын, оқырманды және кітапханашыны ортақ платформаға біріктіреді. Жүйеде каталог, брондау, қорды басқару, оқырман статистикасы және кітап ұсыну мүмкіндіктері іске асырылды. Жобамыз мектеп кітапханасының жұмысын цифрландыруға бағытталған. Назарларыңызға рақмет!</w:t>
+        <w:t>Qalam кітап іздеуді, брондауды және қор есебін біріктіреді. Назарларыңызға рақмет!</w:t>
       </w:r>
     </w:p>
     <w:p>
@@ -118,7 +118,7 @@
     </w:p>
     <w:p>
       <w:r>
-        <w:t>Сайттың «Презентация» бөлімін ашыңыздар. Барлық бөлім бір бетте көрсетіледі. Айбын мен Елжан мәтінді бөлімдердің ретімен кезектесіп айтады. Қорғауға дейін мәтінді дауыстап оқып, ұзақтығын өлшеңіздер.</w:t>
+        <w:t>Презентацияны ашып, бөлімдердің ретімен кезектесіп сөйлеңіздер. Алдын ала дауыстап оқып көріңіздер.</w:t>
       </w:r>
     </w:p>
     <w:sectPr>

</xml_diff>

<commit_message>
Simplify defense text and add joint explanation prompt after section four
</commit_message>
<xml_diff>
--- a/web/downloads/Qalam-7-minutes.docx
+++ b/web/downloads/Qalam-7-minutes.docx
@@ -53,7 +53,7 @@
     </w:p>
     <w:p>
       <w:r>
-        <w:t>Мақсатымыз — кітапты оңай табу, брондау және кітап қорын есепке алу.</w:t>
+        <w:t>Мақсатымыз — кітап табуды және алдын ала таңдауды жеңілдету.</w:t>
       </w:r>
     </w:p>
     <w:p>
@@ -61,12 +61,12 @@
         <w:pStyle w:val="Heading2"/>
       </w:pPr>
       <w:r>
-        <w:t>3-бөлім. Зерттеу әдісі · Айбын</w:t>
+        <w:t>3-бөлім. Қалай тексереміз? · Айбын</w:t>
       </w:r>
     </w:p>
     <w:p>
       <w:r>
-        <w:t>Қағаз тізім мен сайттан кітап іздеуді салыстырамыз. Уақытын өлшейміз. Оқушылардан сауалнама аламыз.</w:t>
+        <w:t>Кітапты қағаздан және сайттан іздеп, кеткен уақытты салыстырамыз.</w:t>
       </w:r>
     </w:p>
     <w:p>
@@ -79,7 +79,20 @@
     </w:p>
     <w:p>
       <w:r>
-        <w:t>Оқушы кітап іздейді, брондайды және пікір жазады. Кітапханашы қорды басқарады, кітаптың берілуі мен қайтарылуын тіркейді. Сайтта кітап тарихы мен рейтинг бар.</w:t>
+        <w:t>Оқушы кітап таңдайды. Кітапханашы кім кітап алғанын, қайтарғанын көреді.</w:t>
+      </w:r>
+    </w:p>
+    <w:p>
+      <w:pPr>
+        <w:pStyle w:val="Heading1"/>
+      </w:pPr>
+      <w:r>
+        <w:t>АЙБЫН ДА, ЕЛЖАН ДА: САЙТТЫҢ ФУНКЦИЯЛАРЫН ӨЗ СӨЗІМЕН ТҮСІНДІРУ</w:t>
+      </w:r>
+    </w:p>
+    <w:p>
+      <w:r>
+        <w:t>Бұл — екеуіне арналған нұсқау. Осы жерде сайттың не істейтінін өз сөздеріңмен түсіндіріңдер. Содан кейін 5-бөлімге өтіңдер.</w:t>
       </w:r>
     </w:p>
     <w:p>
@@ -92,7 +105,7 @@
     </w:p>
     <w:p>
       <w:r>
-        <w:t>Кітапты табуға кеткен уақыт пен оқушылардың пікірін бағалаймыз. Сол арқылы сайтты жақсартамыз.</w:t>
+        <w:t>Оқушылардың пікірін сұрап, сайтты жақсартамыз.</w:t>
       </w:r>
     </w:p>
     <w:p>
@@ -105,7 +118,7 @@
     </w:p>
     <w:p>
       <w:r>
-        <w:t>Qalam кітап іздеуді, брондауды және қор есебін біріктіреді. Назарларыңызға рақмет!</w:t>
+        <w:t>Qalam — мектептің онлайн кітапханасы. Назарларыңызға рақмет!</w:t>
       </w:r>
     </w:p>
     <w:p>

</xml_diff>

<commit_message>
Simplify supplied defense speech and use plain good-day greeting
</commit_message>
<xml_diff>
--- a/web/downloads/Qalam-7-minutes.docx
+++ b/web/downloads/Qalam-7-minutes.docx
@@ -40,7 +40,7 @@
     </w:p>
     <w:p>
       <w:r>
-        <w:t>Қайырлы күн, құрметті қазылар! Біз — Қаныш Сәтпаев атындағы Жәнтікей орта мектебінің 7-сынып оқушылары Амантай Елжан және Мұхаметкәрім Айбын. Жетекшіміз — Мұхаметкәрім Қаныш Саятұлы. Жобамыз — Qalam онлайн кітапханасы.</w:t>
+        <w:t>Қайырлы күн! Біз — Қаныш Сәтпаев атындағы Жәнтікей орта мектебінің 7-сынып оқушылары Амантай Елжан және Мұхаметкәрім Айбын. Жобамыздың тақырыбы — «Онлайн кітапхана: кітапхана жұмысын цифрландыру». Жетекшіміз — Мұхаметкәрім Қаныш Саятұлы. Біз мектеп кітапханасына Qalam сайтын жасадық.</w:t>
       </w:r>
     </w:p>
     <w:p>
@@ -53,7 +53,7 @@
     </w:p>
     <w:p>
       <w:r>
-        <w:t>Мақсатымыз — кітап табуды және алдын ала таңдауды жеңілдету.</w:t>
+        <w:t>Мақсатымыз — кітап табуды, алдын ала таңдауды және кітап санын есептеуді жеңілдету. Оқушы кітапты аты немесе авторы бойынша іздейді. Кітапханашы кім кітап алғанын және қайтарғанын көреді.</w:t>
       </w:r>
     </w:p>
     <w:p>
@@ -66,7 +66,7 @@
     </w:p>
     <w:p>
       <w:r>
-        <w:t>Кітапты қағаздан және сайттан іздеп, кеткен уақытты салыстырамыз.</w:t>
+        <w:t>Сайт кітап таңдауды жеңілдете ме? Оны білу үшін кітапты қағаз тізімнен және сайттан іздейміз. Кеткен уақытты салыстырамыз. Оқушылардан сайтты қолданғанға дейін және кейін пікір сұраймыз.</w:t>
       </w:r>
     </w:p>
     <w:p>
@@ -79,7 +79,7 @@
     </w:p>
     <w:p>
       <w:r>
-        <w:t>Оқушы кітап таңдайды. Кітапханашы кім кітап алғанын, қайтарғанын көреді.</w:t>
+        <w:t>Әр оқушының жеке аккаунты бар. Кітапханашы кітап қосып, дана санын өзгертеді. Оқушылар баға беріп, пікір жазады. Оларды бәрі көреді. Кітапханашы пікірді жасырып, қайта көрсете алады. Сайтта кім қандай кітап алғаны және кім көп оқығаны көрсетіледі.</w:t>
       </w:r>
     </w:p>
     <w:p>
@@ -105,7 +105,7 @@
     </w:p>
     <w:p>
       <w:r>
-        <w:t>Оқушылардың пікірін сұрап, сайтты жақсартамыз.</w:t>
+        <w:t>Кітапты табуға кеткен уақыт пен оқушылардың пікірін қараймыз. Осы арқылы сайттың қаншалықты пайдалы екенін білеміз. Оқушылардың ұсынысына қарай сайтты жақсартамыз.</w:t>
       </w:r>
     </w:p>
     <w:p>
@@ -118,7 +118,7 @@
     </w:p>
     <w:p>
       <w:r>
-        <w:t>Qalam — мектептің онлайн кітапханасы. Назарларыңызға рақмет!</w:t>
+        <w:t>Qalam оқушыға кітап таңдауға, ал кітапханашыға кітаптарды есепке алуға көмектеседі. Сайттан кітап іздеуге, алдын ала таңдауға және оқу нәтижесін көруге болады. Назарларыңызға рақмет!</w:t>
       </w:r>
     </w:p>
     <w:p>

</xml_diff>